<commit_message>
SmartMat: pushup preserved, squat 5s-3s-3calibration implemented
</commit_message>
<xml_diff>
--- a/스마트 매트 프로젝트.docx
+++ b/스마트 매트 프로젝트.docx
@@ -40,21 +40,7 @@
         <w:rPr>
           <w:rStyle w:val="ab"/>
         </w:rPr>
-        <w:t xml:space="preserve">압력 분포 기반 </w:t>
-      </w:r>
-      <w:proofErr w:type="spellStart"/>
-      <w:r>
-        <w:rPr>
-          <w:rStyle w:val="ab"/>
-        </w:rPr>
-        <w:t>푸쉬업</w:t>
-      </w:r>
-      <w:proofErr w:type="spellEnd"/>
-      <w:r>
-        <w:rPr>
-          <w:rStyle w:val="ab"/>
-        </w:rPr>
-        <w:t xml:space="preserve"> 자세 피드백 스마트 매트</w:t>
+        <w:t>압력 분포 기반 푸쉬업 자세 피드백 스마트 매트</w:t>
       </w:r>
     </w:p>
     <w:p>
@@ -129,31 +115,7 @@
           <w:sz w:val="24"/>
           <w14:ligatures w14:val="none"/>
         </w:rPr>
-        <w:t xml:space="preserve">카메라 없이 압력센서만을 이용해 </w:t>
-      </w:r>
-      <w:proofErr w:type="spellStart"/>
-      <w:r>
-        <w:rPr>
-          <w:rFonts w:ascii="굴림" w:eastAsia="굴림" w:hAnsi="굴림" w:cs="굴림"/>
-          <w:b/>
-          <w:bCs/>
-          <w:kern w:val="0"/>
-          <w:sz w:val="24"/>
-          <w14:ligatures w14:val="none"/>
-        </w:rPr>
-        <w:t>푸쉬업</w:t>
-      </w:r>
-      <w:proofErr w:type="spellEnd"/>
-      <w:r>
-        <w:rPr>
-          <w:rFonts w:ascii="굴림" w:eastAsia="굴림" w:hAnsi="굴림" w:cs="굴림"/>
-          <w:b/>
-          <w:bCs/>
-          <w:kern w:val="0"/>
-          <w:sz w:val="24"/>
-          <w14:ligatures w14:val="none"/>
-        </w:rPr>
-        <w:t xml:space="preserve"> 수행 시의 자세 이상을 감지하고,</w:t>
+        <w:t>카메라 없이 압력센서만을 이용해 푸쉬업 수행 시의 자세 이상을 감지하고,</w:t>
       </w:r>
       <w:r>
         <w:rPr>
@@ -675,31 +637,7 @@
           <w:sz w:val="24"/>
           <w14:ligatures w14:val="none"/>
         </w:rPr>
-        <w:t xml:space="preserve">정상 </w:t>
-      </w:r>
-      <w:proofErr w:type="spellStart"/>
-      <w:r>
-        <w:rPr>
-          <w:rFonts w:ascii="굴림" w:eastAsia="굴림" w:hAnsi="굴림" w:cs="굴림"/>
-          <w:b/>
-          <w:bCs/>
-          <w:kern w:val="0"/>
-          <w:sz w:val="24"/>
-          <w14:ligatures w14:val="none"/>
-        </w:rPr>
-        <w:t>푸쉬업을</w:t>
-      </w:r>
-      <w:proofErr w:type="spellEnd"/>
-      <w:r>
-        <w:rPr>
-          <w:rFonts w:ascii="굴림" w:eastAsia="굴림" w:hAnsi="굴림" w:cs="굴림"/>
-          <w:b/>
-          <w:bCs/>
-          <w:kern w:val="0"/>
-          <w:sz w:val="24"/>
-          <w14:ligatures w14:val="none"/>
-        </w:rPr>
-        <w:t xml:space="preserve"> 수행</w:t>
+        <w:t>정상 푸쉬업을 수행</w:t>
       </w:r>
     </w:p>
     <w:p>
@@ -1016,25 +954,14 @@
           <w14:ligatures w14:val="none"/>
         </w:rPr>
       </w:pPr>
-      <w:proofErr w:type="spellStart"/>
-      <w:r>
-        <w:rPr>
-          <w:rFonts w:ascii="굴림" w:eastAsia="굴림" w:hAnsi="굴림" w:cs="굴림"/>
-          <w:kern w:val="0"/>
-          <w:sz w:val="24"/>
-          <w14:ligatures w14:val="none"/>
-        </w:rPr>
-        <w:t>마이크로컨트롤러</w:t>
-      </w:r>
-      <w:proofErr w:type="spellEnd"/>
-      <w:r>
-        <w:rPr>
-          <w:rFonts w:ascii="굴림" w:eastAsia="굴림" w:hAnsi="굴림" w:cs="굴림"/>
-          <w:kern w:val="0"/>
-          <w:sz w:val="24"/>
-          <w14:ligatures w14:val="none"/>
-        </w:rPr>
-        <w:t xml:space="preserve"> (Arduino 또는 ESP 계열)</w:t>
+      <w:r>
+        <w:rPr>
+          <w:rFonts w:ascii="굴림" w:eastAsia="굴림" w:hAnsi="굴림" w:cs="굴림"/>
+          <w:kern w:val="0"/>
+          <w:sz w:val="24"/>
+          <w14:ligatures w14:val="none"/>
+        </w:rPr>
+        <w:t>마이크로컨트롤러 (Arduino 또는 ESP 계열)</w:t>
       </w:r>
     </w:p>
     <w:p>
@@ -1130,7 +1057,6 @@
           <w14:ligatures w14:val="none"/>
         </w:rPr>
       </w:pPr>
-      <w:proofErr w:type="spellStart"/>
       <w:r>
         <w:rPr>
           <w:rFonts w:ascii="굴림" w:eastAsia="굴림" w:hAnsi="굴림" w:cs="굴림" w:hint="eastAsia"/>
@@ -1138,17 +1064,7 @@
           <w:sz w:val="24"/>
           <w14:ligatures w14:val="none"/>
         </w:rPr>
-        <w:t>아두이노</w:t>
-      </w:r>
-      <w:proofErr w:type="spellEnd"/>
-      <w:r>
-        <w:rPr>
-          <w:rFonts w:ascii="굴림" w:eastAsia="굴림" w:hAnsi="굴림" w:cs="굴림" w:hint="eastAsia"/>
-          <w:kern w:val="0"/>
-          <w:sz w:val="24"/>
-          <w14:ligatures w14:val="none"/>
-        </w:rPr>
-        <w:t xml:space="preserve"> 시계 </w:t>
+        <w:t xml:space="preserve">아두이노 시계 </w:t>
       </w:r>
       <w:r>
         <w:rPr>
@@ -1210,7 +1126,6 @@
           <w14:ligatures w14:val="none"/>
         </w:rPr>
       </w:pPr>
-      <w:proofErr w:type="spellStart"/>
       <w:r>
         <w:rPr>
           <w:rFonts w:ascii="굴림" w:eastAsia="굴림" w:hAnsi="굴림" w:cs="굴림" w:hint="eastAsia"/>
@@ -1218,17 +1133,7 @@
           <w:sz w:val="24"/>
           <w14:ligatures w14:val="none"/>
         </w:rPr>
-        <w:t>아두이노</w:t>
-      </w:r>
-      <w:proofErr w:type="spellEnd"/>
-      <w:r>
-        <w:rPr>
-          <w:rFonts w:ascii="굴림" w:eastAsia="굴림" w:hAnsi="굴림" w:cs="굴림" w:hint="eastAsia"/>
-          <w:kern w:val="0"/>
-          <w:sz w:val="24"/>
-          <w14:ligatures w14:val="none"/>
-        </w:rPr>
-        <w:t xml:space="preserve"> </w:t>
+        <w:t xml:space="preserve">아두이노 </w:t>
       </w:r>
       <w:r>
         <w:rPr>
@@ -1257,7 +1162,7 @@
         <w:autoSpaceDN/>
         <w:spacing w:before="100" w:beforeAutospacing="1" w:after="100" w:afterAutospacing="1"/>
         <w:rPr>
-          <w:rFonts w:ascii="굴림" w:eastAsia="굴림" w:hAnsi="굴림" w:cs="굴림" w:hint="eastAsia"/>
+          <w:rFonts w:ascii="굴림" w:eastAsia="굴림" w:hAnsi="굴림" w:cs="굴림"/>
           <w:kern w:val="0"/>
           <w:sz w:val="24"/>
           <w14:ligatures w14:val="none"/>
@@ -1523,7 +1428,6 @@
           <w14:ligatures w14:val="none"/>
         </w:rPr>
       </w:pPr>
-      <w:proofErr w:type="spellStart"/>
       <w:r>
         <w:rPr>
           <w:rFonts w:ascii="Apple Color Emoji" w:eastAsia="굴림" w:hAnsi="Apple Color Emoji" w:cs="Apple Color Emoji" w:hint="eastAsia"/>
@@ -1533,7 +1437,6 @@
         </w:rPr>
         <w:t>벨크로테이프로</w:t>
       </w:r>
-      <w:proofErr w:type="spellEnd"/>
       <w:r>
         <w:rPr>
           <w:rFonts w:ascii="Apple Color Emoji" w:eastAsia="굴림" w:hAnsi="Apple Color Emoji" w:cs="Apple Color Emoji" w:hint="eastAsia"/>
@@ -1633,112 +1536,21 @@
         <w:autoSpaceDN/>
         <w:spacing w:before="100" w:beforeAutospacing="1" w:after="100" w:afterAutospacing="1"/>
         <w:rPr>
+          <w:rFonts w:ascii="굴림" w:eastAsia="굴림" w:hAnsi="굴림" w:cs="굴림"/>
+          <w:kern w:val="0"/>
+          <w:sz w:val="24"/>
+          <w14:ligatures w14:val="none"/>
+        </w:rPr>
+      </w:pPr>
+      <w:r>
+        <w:rPr>
           <w:rFonts w:ascii="굴림" w:eastAsia="굴림" w:hAnsi="굴림" w:cs="굴림" w:hint="eastAsia"/>
           <w:kern w:val="0"/>
           <w:sz w:val="24"/>
           <w14:ligatures w14:val="none"/>
         </w:rPr>
-      </w:pPr>
-      <w:r>
-        <w:rPr>
-          <w:rFonts w:ascii="굴림" w:eastAsia="굴림" w:hAnsi="굴림" w:cs="굴림" w:hint="eastAsia"/>
-          <w:kern w:val="0"/>
-          <w:sz w:val="24"/>
-          <w14:ligatures w14:val="none"/>
-        </w:rPr>
-        <w:t xml:space="preserve">처음 3회를 기준으로 </w:t>
-      </w:r>
-      <w:proofErr w:type="spellStart"/>
-      <w:r>
-        <w:rPr>
-          <w:rFonts w:ascii="굴림" w:eastAsia="굴림" w:hAnsi="굴림" w:cs="굴림" w:hint="eastAsia"/>
-          <w:kern w:val="0"/>
-          <w:sz w:val="24"/>
-          <w14:ligatures w14:val="none"/>
-        </w:rPr>
-        <w:t>그사람</w:t>
-      </w:r>
-      <w:proofErr w:type="spellEnd"/>
-      <w:r>
-        <w:rPr>
-          <w:rFonts w:ascii="굴림" w:eastAsia="굴림" w:hAnsi="굴림" w:cs="굴림" w:hint="eastAsia"/>
-          <w:kern w:val="0"/>
-          <w:sz w:val="24"/>
-          <w14:ligatures w14:val="none"/>
-        </w:rPr>
-        <w:t xml:space="preserve"> 몸무게 </w:t>
-      </w:r>
-      <w:proofErr w:type="spellStart"/>
-      <w:r>
-        <w:rPr>
-          <w:rFonts w:ascii="굴림" w:eastAsia="굴림" w:hAnsi="굴림" w:cs="굴림" w:hint="eastAsia"/>
-          <w:kern w:val="0"/>
-          <w:sz w:val="24"/>
-          <w14:ligatures w14:val="none"/>
-        </w:rPr>
-        <w:t>이런거</w:t>
-      </w:r>
-      <w:proofErr w:type="spellEnd"/>
-      <w:r>
-        <w:rPr>
-          <w:rFonts w:ascii="굴림" w:eastAsia="굴림" w:hAnsi="굴림" w:cs="굴림" w:hint="eastAsia"/>
-          <w:kern w:val="0"/>
-          <w:sz w:val="24"/>
-          <w14:ligatures w14:val="none"/>
-        </w:rPr>
-        <w:t xml:space="preserve"> 생각해서 고정된 </w:t>
-      </w:r>
-      <w:proofErr w:type="spellStart"/>
-      <w:r>
-        <w:rPr>
-          <w:rFonts w:ascii="굴림" w:eastAsia="굴림" w:hAnsi="굴림" w:cs="굴림" w:hint="eastAsia"/>
-          <w:kern w:val="0"/>
-          <w:sz w:val="24"/>
-          <w14:ligatures w14:val="none"/>
-        </w:rPr>
-        <w:t>압력값말고</w:t>
-      </w:r>
-      <w:proofErr w:type="spellEnd"/>
-      <w:r>
-        <w:rPr>
-          <w:rFonts w:ascii="굴림" w:eastAsia="굴림" w:hAnsi="굴림" w:cs="굴림" w:hint="eastAsia"/>
-          <w:kern w:val="0"/>
-          <w:sz w:val="24"/>
-          <w14:ligatures w14:val="none"/>
-        </w:rPr>
-        <w:t xml:space="preserve"> 유동적인 </w:t>
-      </w:r>
-      <w:proofErr w:type="spellStart"/>
-      <w:r>
-        <w:rPr>
-          <w:rFonts w:ascii="굴림" w:eastAsia="굴림" w:hAnsi="굴림" w:cs="굴림" w:hint="eastAsia"/>
-          <w:kern w:val="0"/>
-          <w:sz w:val="24"/>
-          <w14:ligatures w14:val="none"/>
-        </w:rPr>
-        <w:t>압력값으로</w:t>
-      </w:r>
-      <w:proofErr w:type="spellEnd"/>
-      <w:r>
-        <w:rPr>
-          <w:rFonts w:ascii="굴림" w:eastAsia="굴림" w:hAnsi="굴림" w:cs="굴림" w:hint="eastAsia"/>
-          <w:kern w:val="0"/>
-          <w:sz w:val="24"/>
-          <w14:ligatures w14:val="none"/>
-        </w:rPr>
-        <w:t xml:space="preserve"> </w:t>
-      </w:r>
-      <w:proofErr w:type="spellStart"/>
-      <w:r>
-        <w:rPr>
-          <w:rFonts w:ascii="굴림" w:eastAsia="굴림" w:hAnsi="굴림" w:cs="굴림" w:hint="eastAsia"/>
-          <w:kern w:val="0"/>
-          <w:sz w:val="24"/>
-          <w14:ligatures w14:val="none"/>
-        </w:rPr>
-        <w:t>ㄱㄱ</w:t>
-      </w:r>
-      <w:proofErr w:type="spellEnd"/>
+        <w:t>처음 3회를 기준으로 그사람 몸무게 이런거 생각해서 고정된 압력값말고 유동적인 압력값으로 ㄱㄱ</w:t>
+      </w:r>
     </w:p>
     <w:p>
       <w:pPr>
@@ -1763,29 +1575,50 @@
           <w:szCs w:val="28"/>
         </w:rPr>
       </w:pPr>
-      <w:proofErr w:type="spellStart"/>
       <w:r>
         <w:rPr>
           <w:rFonts w:hint="eastAsia"/>
           <w:sz w:val="24"/>
           <w:szCs w:val="28"/>
         </w:rPr>
-        <w:t>푸쉬업</w:t>
-      </w:r>
-      <w:proofErr w:type="spellEnd"/>
+        <w:t xml:space="preserve">푸쉬업 </w:t>
+      </w:r>
+      <w:r>
+        <w:rPr>
+          <w:sz w:val="24"/>
+          <w:szCs w:val="28"/>
+        </w:rPr>
+        <w:t>–</w:t>
+      </w:r>
       <w:r>
         <w:rPr>
           <w:rFonts w:hint="eastAsia"/>
           <w:sz w:val="24"/>
           <w:szCs w:val="28"/>
         </w:rPr>
-        <w:t xml:space="preserve"> </w:t>
-      </w:r>
-      <w:r>
+        <w:t xml:space="preserve"> 앞센서, 뒷센서의 무게차이 ㄱㄱ</w:t>
+      </w:r>
+    </w:p>
+    <w:p>
+      <w:pPr>
         <w:rPr>
           <w:sz w:val="24"/>
           <w:szCs w:val="28"/>
         </w:rPr>
+      </w:pPr>
+      <w:r>
+        <w:rPr>
+          <w:rFonts w:hint="eastAsia"/>
+          <w:sz w:val="24"/>
+          <w:szCs w:val="28"/>
+        </w:rPr>
+        <w:t xml:space="preserve">스쿼트 </w:t>
+      </w:r>
+      <w:r>
+        <w:rPr>
+          <w:sz w:val="24"/>
+          <w:szCs w:val="28"/>
+        </w:rPr>
         <w:t>–</w:t>
       </w:r>
       <w:r>
@@ -1794,196 +1627,51 @@
           <w:sz w:val="24"/>
           <w:szCs w:val="28"/>
         </w:rPr>
-        <w:t xml:space="preserve"> </w:t>
-      </w:r>
-      <w:proofErr w:type="spellStart"/>
+        <w:t xml:space="preserve"> 앞센서, 뒷센서의 무게차이 ㄱㄱ</w:t>
+      </w:r>
+    </w:p>
+    <w:p>
+      <w:pPr>
+        <w:rPr>
+          <w:sz w:val="24"/>
+          <w:szCs w:val="28"/>
+        </w:rPr>
+      </w:pPr>
       <w:r>
         <w:rPr>
           <w:rFonts w:hint="eastAsia"/>
           <w:sz w:val="24"/>
           <w:szCs w:val="28"/>
         </w:rPr>
-        <w:t>앞센서</w:t>
-      </w:r>
-      <w:proofErr w:type="spellEnd"/>
+        <w:t xml:space="preserve">플랭크 </w:t>
+      </w:r>
+      <w:r>
+        <w:rPr>
+          <w:sz w:val="24"/>
+          <w:szCs w:val="28"/>
+        </w:rPr>
+        <w:t>–</w:t>
+      </w:r>
       <w:r>
         <w:rPr>
           <w:rFonts w:hint="eastAsia"/>
           <w:sz w:val="24"/>
           <w:szCs w:val="28"/>
         </w:rPr>
-        <w:t xml:space="preserve">, </w:t>
-      </w:r>
-      <w:proofErr w:type="spellStart"/>
-      <w:r>
-        <w:rPr>
-          <w:rFonts w:hint="eastAsia"/>
+        <w:t xml:space="preserve"> 무게0아니면, 시간계산</w:t>
+      </w:r>
+    </w:p>
+    <w:p>
+      <w:pPr>
+        <w:rPr>
           <w:sz w:val="24"/>
           <w:szCs w:val="28"/>
         </w:rPr>
-        <w:t>뒷센서의</w:t>
-      </w:r>
-      <w:proofErr w:type="spellEnd"/>
-      <w:r>
-        <w:rPr>
-          <w:rFonts w:hint="eastAsia"/>
-          <w:sz w:val="24"/>
-          <w:szCs w:val="28"/>
-        </w:rPr>
-        <w:t xml:space="preserve"> 무게차이 </w:t>
-      </w:r>
-      <w:proofErr w:type="spellStart"/>
-      <w:r>
-        <w:rPr>
-          <w:rFonts w:hint="eastAsia"/>
-          <w:sz w:val="24"/>
-          <w:szCs w:val="28"/>
-        </w:rPr>
-        <w:t>ㄱㄱ</w:t>
-      </w:r>
-      <w:proofErr w:type="spellEnd"/>
-    </w:p>
-    <w:p>
-      <w:pPr>
-        <w:rPr>
-          <w:rFonts w:hint="eastAsia"/>
-          <w:sz w:val="24"/>
-          <w:szCs w:val="28"/>
-        </w:rPr>
-      </w:pPr>
-      <w:proofErr w:type="spellStart"/>
-      <w:r>
-        <w:rPr>
-          <w:rFonts w:hint="eastAsia"/>
-          <w:sz w:val="24"/>
-          <w:szCs w:val="28"/>
-        </w:rPr>
-        <w:t>스쿼트</w:t>
-      </w:r>
-      <w:proofErr w:type="spellEnd"/>
-      <w:r>
-        <w:rPr>
-          <w:rFonts w:hint="eastAsia"/>
-          <w:sz w:val="24"/>
-          <w:szCs w:val="28"/>
-        </w:rPr>
-        <w:t xml:space="preserve"> </w:t>
-      </w:r>
-      <w:r>
-        <w:rPr>
-          <w:sz w:val="24"/>
-          <w:szCs w:val="28"/>
-        </w:rPr>
-        <w:t>–</w:t>
-      </w:r>
-      <w:r>
-        <w:rPr>
-          <w:rFonts w:hint="eastAsia"/>
-          <w:sz w:val="24"/>
-          <w:szCs w:val="28"/>
-        </w:rPr>
-        <w:t xml:space="preserve"> </w:t>
-      </w:r>
-      <w:proofErr w:type="spellStart"/>
-      <w:r>
-        <w:rPr>
-          <w:rFonts w:hint="eastAsia"/>
-          <w:sz w:val="24"/>
-          <w:szCs w:val="28"/>
-        </w:rPr>
-        <w:t>앞센서</w:t>
-      </w:r>
-      <w:proofErr w:type="spellEnd"/>
-      <w:r>
-        <w:rPr>
-          <w:rFonts w:hint="eastAsia"/>
-          <w:sz w:val="24"/>
-          <w:szCs w:val="28"/>
-        </w:rPr>
-        <w:t xml:space="preserve">, </w:t>
-      </w:r>
-      <w:proofErr w:type="spellStart"/>
-      <w:r>
-        <w:rPr>
-          <w:rFonts w:hint="eastAsia"/>
-          <w:sz w:val="24"/>
-          <w:szCs w:val="28"/>
-        </w:rPr>
-        <w:t>뒷센서의</w:t>
-      </w:r>
-      <w:proofErr w:type="spellEnd"/>
-      <w:r>
-        <w:rPr>
-          <w:rFonts w:hint="eastAsia"/>
-          <w:sz w:val="24"/>
-          <w:szCs w:val="28"/>
-        </w:rPr>
-        <w:t xml:space="preserve"> 무게차이 </w:t>
-      </w:r>
-      <w:proofErr w:type="spellStart"/>
-      <w:r>
-        <w:rPr>
-          <w:rFonts w:hint="eastAsia"/>
-          <w:sz w:val="24"/>
-          <w:szCs w:val="28"/>
-        </w:rPr>
-        <w:t>ㄱㄱ</w:t>
-      </w:r>
-      <w:proofErr w:type="spellEnd"/>
-    </w:p>
-    <w:p>
-      <w:pPr>
-        <w:rPr>
-          <w:sz w:val="24"/>
-          <w:szCs w:val="28"/>
-        </w:rPr>
-      </w:pPr>
-      <w:proofErr w:type="spellStart"/>
-      <w:r>
-        <w:rPr>
-          <w:rFonts w:hint="eastAsia"/>
-          <w:sz w:val="24"/>
-          <w:szCs w:val="28"/>
-        </w:rPr>
-        <w:t>플랭크</w:t>
-      </w:r>
-      <w:proofErr w:type="spellEnd"/>
-      <w:r>
-        <w:rPr>
-          <w:rFonts w:hint="eastAsia"/>
-          <w:sz w:val="24"/>
-          <w:szCs w:val="28"/>
-        </w:rPr>
-        <w:t xml:space="preserve"> </w:t>
-      </w:r>
-      <w:r>
-        <w:rPr>
-          <w:sz w:val="24"/>
-          <w:szCs w:val="28"/>
-        </w:rPr>
-        <w:t>–</w:t>
-      </w:r>
-      <w:r>
-        <w:rPr>
-          <w:rFonts w:hint="eastAsia"/>
-          <w:sz w:val="24"/>
-          <w:szCs w:val="28"/>
-        </w:rPr>
-        <w:t xml:space="preserve"> 무게0아니면, 시간계산</w:t>
-      </w:r>
-    </w:p>
-    <w:p>
-      <w:pPr>
-        <w:rPr>
-          <w:sz w:val="24"/>
-          <w:szCs w:val="28"/>
-        </w:rPr>
-      </w:pPr>
-    </w:p>
-    <w:p>
-      <w:pPr>
-        <w:rPr>
-          <w:rFonts w:hint="eastAsia"/>
+      </w:pPr>
+    </w:p>
+    <w:p>
+      <w:pPr>
+        <w:rPr>
           <w:sz w:val="24"/>
           <w:szCs w:val="28"/>
         </w:rPr>
@@ -2008,20 +1696,76 @@
           <w:szCs w:val="40"/>
         </w:rPr>
       </w:pPr>
-    </w:p>
-    <w:p>
-      <w:pPr>
-        <w:rPr>
+      <w:r>
+        <w:rPr>
+          <w:rFonts w:hint="eastAsia"/>
           <w:b/>
           <w:bCs/>
           <w:sz w:val="36"/>
           <w:szCs w:val="40"/>
         </w:rPr>
-      </w:pPr>
-    </w:p>
-    <w:p>
-      <w:pPr>
-        <w:rPr>
+        <w:t>푸쉬업</w:t>
+      </w:r>
+    </w:p>
+    <w:p>
+      <w:pPr>
+        <w:rPr>
+          <w:sz w:val="21"/>
+          <w:szCs w:val="22"/>
+        </w:rPr>
+      </w:pPr>
+      <w:r>
+        <w:rPr>
+          <w:sz w:val="21"/>
+          <w:szCs w:val="22"/>
+        </w:rPr>
+        <w:t>DOWN</w:t>
+      </w:r>
+      <w:r>
+        <w:rPr>
+          <w:rFonts w:hint="eastAsia"/>
+          <w:sz w:val="21"/>
+          <w:szCs w:val="22"/>
+        </w:rPr>
+        <w:t xml:space="preserve"> 상태일때 양손/양발의 합 3회로 평균값 먹이는걸로 학습</w:t>
+      </w:r>
+    </w:p>
+    <w:p>
+      <w:pPr>
+        <w:rPr>
+          <w:sz w:val="21"/>
+          <w:szCs w:val="22"/>
+        </w:rPr>
+      </w:pPr>
+      <w:r>
+        <w:rPr>
+          <w:rFonts w:hint="eastAsia"/>
+          <w:sz w:val="21"/>
+          <w:szCs w:val="22"/>
+        </w:rPr>
+        <w:t>2번핀 -&gt; 리셋</w:t>
+      </w:r>
+    </w:p>
+    <w:p>
+      <w:pPr>
+        <w:rPr>
+          <w:sz w:val="21"/>
+          <w:szCs w:val="22"/>
+        </w:rPr>
+      </w:pPr>
+      <w:r>
+        <w:rPr>
+          <w:rFonts w:hint="eastAsia"/>
+          <w:sz w:val="21"/>
+          <w:szCs w:val="22"/>
+        </w:rPr>
+        <w:t>3번핀 -&gt; 모드선택</w:t>
+      </w:r>
+    </w:p>
+    <w:p>
+      <w:pPr>
+        <w:rPr>
+          <w:rFonts w:hint="eastAsia"/>
           <w:b/>
           <w:bCs/>
           <w:sz w:val="36"/>
@@ -2032,6 +1776,225 @@
     <w:p>
       <w:pPr>
         <w:rPr>
+          <w:sz w:val="21"/>
+          <w:szCs w:val="22"/>
+        </w:rPr>
+      </w:pPr>
+      <w:r>
+        <w:rPr>
+          <w:sz w:val="21"/>
+          <w:szCs w:val="22"/>
+        </w:rPr>
+        <w:t>[MODE_SELECT]</w:t>
+      </w:r>
+    </w:p>
+    <w:p>
+      <w:pPr>
+        <w:rPr>
+          <w:sz w:val="21"/>
+          <w:szCs w:val="22"/>
+        </w:rPr>
+      </w:pPr>
+      <w:r>
+        <w:rPr>
+          <w:sz w:val="21"/>
+          <w:szCs w:val="22"/>
+        </w:rPr>
+        <w:t xml:space="preserve">   MODE  → 선택지 이동</w:t>
+      </w:r>
+    </w:p>
+    <w:p>
+      <w:pPr>
+        <w:rPr>
+          <w:sz w:val="21"/>
+          <w:szCs w:val="22"/>
+        </w:rPr>
+      </w:pPr>
+      <w:r>
+        <w:rPr>
+          <w:sz w:val="21"/>
+          <w:szCs w:val="22"/>
+        </w:rPr>
+        <w:t xml:space="preserve">   RESET → 선택 확정 → CALIBRATION</w:t>
+      </w:r>
+    </w:p>
+    <w:p>
+      <w:pPr>
+        <w:rPr>
+          <w:sz w:val="21"/>
+          <w:szCs w:val="22"/>
+        </w:rPr>
+      </w:pPr>
+    </w:p>
+    <w:p>
+      <w:pPr>
+        <w:rPr>
+          <w:sz w:val="21"/>
+          <w:szCs w:val="22"/>
+        </w:rPr>
+      </w:pPr>
+      <w:r>
+        <w:rPr>
+          <w:sz w:val="21"/>
+          <w:szCs w:val="22"/>
+        </w:rPr>
+        <w:t>[CALIBRATION]</w:t>
+      </w:r>
+    </w:p>
+    <w:p>
+      <w:pPr>
+        <w:rPr>
+          <w:sz w:val="21"/>
+          <w:szCs w:val="22"/>
+        </w:rPr>
+      </w:pPr>
+      <w:r>
+        <w:rPr>
+          <w:sz w:val="21"/>
+          <w:szCs w:val="22"/>
+        </w:rPr>
+        <w:t xml:space="preserve">   RESET → 다시 캘리브레이션</w:t>
+      </w:r>
+    </w:p>
+    <w:p>
+      <w:pPr>
+        <w:rPr>
+          <w:sz w:val="21"/>
+          <w:szCs w:val="22"/>
+        </w:rPr>
+      </w:pPr>
+    </w:p>
+    <w:p>
+      <w:pPr>
+        <w:rPr>
+          <w:sz w:val="21"/>
+          <w:szCs w:val="22"/>
+        </w:rPr>
+      </w:pPr>
+      <w:r>
+        <w:rPr>
+          <w:sz w:val="21"/>
+          <w:szCs w:val="22"/>
+        </w:rPr>
+        <w:t>[NORMAL]</w:t>
+      </w:r>
+    </w:p>
+    <w:p>
+      <w:pPr>
+        <w:rPr>
+          <w:sz w:val="21"/>
+          <w:szCs w:val="22"/>
+        </w:rPr>
+      </w:pPr>
+      <w:r>
+        <w:rPr>
+          <w:sz w:val="21"/>
+          <w:szCs w:val="22"/>
+        </w:rPr>
+        <w:t xml:space="preserve">   </w:t>
+      </w:r>
+      <w:r>
+        <w:rPr>
+          <w:rFonts w:hint="eastAsia"/>
+          <w:sz w:val="21"/>
+          <w:szCs w:val="22"/>
+        </w:rPr>
+        <w:t>리셋 버튼 1개만 누르면 노멀모드에서의 카운트만 리셋</w:t>
+      </w:r>
+    </w:p>
+    <w:p>
+      <w:pPr>
+        <w:rPr>
+          <w:sz w:val="21"/>
+          <w:szCs w:val="22"/>
+        </w:rPr>
+      </w:pPr>
+      <w:r>
+        <w:rPr>
+          <w:rFonts w:hint="eastAsia"/>
+          <w:sz w:val="21"/>
+          <w:szCs w:val="22"/>
+        </w:rPr>
+        <w:t xml:space="preserve">버튼 2개 한꺼번에 누르면 캘리브레이션 단계 3회측정부터 다시 </w:t>
+      </w:r>
+    </w:p>
+    <w:p>
+      <w:pPr>
+        <w:rPr>
+          <w:sz w:val="21"/>
+          <w:szCs w:val="22"/>
+        </w:rPr>
+      </w:pPr>
+    </w:p>
+    <w:p>
+      <w:pPr>
+        <w:tabs>
+          <w:tab w:val="left" w:pos="6248"/>
+        </w:tabs>
+        <w:rPr>
+          <w:sz w:val="21"/>
+          <w:szCs w:val="22"/>
+        </w:rPr>
+      </w:pPr>
+      <w:r>
+        <w:rPr>
+          <w:rFonts w:hint="eastAsia"/>
+          <w:sz w:val="21"/>
+          <w:szCs w:val="22"/>
+        </w:rPr>
+        <w:t>캘리들어가기전에 5초정도 자세잡는 시간 있어야할듯</w:t>
+      </w:r>
+      <w:r>
+        <w:rPr>
+          <w:sz w:val="21"/>
+          <w:szCs w:val="22"/>
+        </w:rPr>
+        <w:tab/>
+      </w:r>
+    </w:p>
+    <w:p>
+      <w:pPr>
+        <w:tabs>
+          <w:tab w:val="left" w:pos="6248"/>
+        </w:tabs>
+        <w:rPr>
+          <w:sz w:val="21"/>
+          <w:szCs w:val="22"/>
+        </w:rPr>
+      </w:pPr>
+      <w:r>
+        <w:rPr>
+          <w:rFonts w:hint="eastAsia"/>
+          <w:sz w:val="21"/>
+          <w:szCs w:val="22"/>
+        </w:rPr>
+        <w:t xml:space="preserve">그리고 정자세일때의 기준값을 정해야지만 좀 더 완벽한 값이 나올듯 </w:t>
+      </w:r>
+    </w:p>
+    <w:p>
+      <w:pPr>
+        <w:tabs>
+          <w:tab w:val="left" w:pos="6248"/>
+        </w:tabs>
+        <w:rPr>
+          <w:rFonts w:hint="eastAsia"/>
+          <w:sz w:val="21"/>
+          <w:szCs w:val="22"/>
+        </w:rPr>
+      </w:pPr>
+    </w:p>
+    <w:p>
+      <w:pPr>
+        <w:rPr>
+          <w:rFonts w:hint="eastAsia"/>
+          <w:sz w:val="21"/>
+          <w:szCs w:val="22"/>
+        </w:rPr>
+      </w:pPr>
+    </w:p>
+    <w:p>
+      <w:pPr>
+        <w:rPr>
           <w:b/>
           <w:bCs/>
           <w:sz w:val="36"/>
@@ -2094,67 +2057,6 @@
         <w:rPr>
           <w:b/>
           <w:bCs/>
-          <w:sz w:val="36"/>
-          <w:szCs w:val="40"/>
-        </w:rPr>
-      </w:pPr>
-    </w:p>
-    <w:p>
-      <w:pPr>
-        <w:rPr>
-          <w:b/>
-          <w:bCs/>
-          <w:sz w:val="36"/>
-          <w:szCs w:val="40"/>
-        </w:rPr>
-      </w:pPr>
-    </w:p>
-    <w:p>
-      <w:pPr>
-        <w:rPr>
-          <w:b/>
-          <w:bCs/>
-          <w:sz w:val="36"/>
-          <w:szCs w:val="40"/>
-        </w:rPr>
-      </w:pPr>
-    </w:p>
-    <w:p>
-      <w:pPr>
-        <w:rPr>
-          <w:b/>
-          <w:bCs/>
-          <w:sz w:val="36"/>
-          <w:szCs w:val="40"/>
-        </w:rPr>
-      </w:pPr>
-    </w:p>
-    <w:p>
-      <w:pPr>
-        <w:rPr>
-          <w:b/>
-          <w:bCs/>
-          <w:sz w:val="36"/>
-          <w:szCs w:val="40"/>
-        </w:rPr>
-      </w:pPr>
-    </w:p>
-    <w:p>
-      <w:pPr>
-        <w:rPr>
-          <w:b/>
-          <w:bCs/>
-          <w:sz w:val="36"/>
-          <w:szCs w:val="40"/>
-        </w:rPr>
-      </w:pPr>
-    </w:p>
-    <w:p>
-      <w:pPr>
-        <w:rPr>
-          <w:rFonts w:hint="eastAsia"/>
-          <w:b/>
-          <w:bCs/>
           <w:sz w:val="24"/>
           <w:szCs w:val="28"/>
         </w:rPr>
@@ -2163,7 +2065,6 @@
     <w:p>
       <w:pPr>
         <w:rPr>
-          <w:rFonts w:hint="eastAsia"/>
           <w:b/>
           <w:bCs/>
           <w:sz w:val="36"/>

</xml_diff>